<commit_message>
Final thesis text: five references, applied angle, within the length limit
Incorporates co-author comments: assembly wording, the rationale for comparing
three assemblies, and the biotechnological relevance of fluoride plasmids.
</commit_message>
<xml_diff>
--- a/thesis/Гильманова_АР.docx
+++ b/thesis/Гильманова_АР.docx
@@ -140,8 +140,17 @@
           <w:szCs w:val="28"/>
           <w:lang w:val="ru-RU"/>
         </w:rPr>
-        <w:t xml:space="preserve">Концентрация фторида в воде минерального источника Хойто-Гол (Восточный Саян, Бурятия) составляет 3,4–3,5 мг/л. Прокариоты выводят фторид экспортёрами Fluc/CrcB и CLCᶠ, экспрессия которых часто регулируется фторидным рибопереключателем [1, 2]. Ген</w:t>
+        <w:t xml:space="preserve">Вода минерального источника Хойто-Гол (Восточный Саян, Бурятия) содержит до 5 мг/л фторида [1] — в несколько раз выше норматива для питьевой воды. Прокариоты выводят фторид экспортёрами Fluc/CrcB и CLCᶠ под контролем фторидного рибопереключателя [2]. Гены устойчивости к антибиотикам и металлам нередко переносятся мобильными генетическими элементами (МГЭ) [3], а для фторида такая связь не изучена. Цель работы — выяснить, связаны ли эти гены с транспозазами и плазмидами.</w:t>
       </w:r>
+    </w:p>
+    <w:p>
+      <w:pPr>
+        <w:pBdr/>
+        <w:spacing w:line="276" w:lineRule="auto"/>
+        <w:ind w:firstLine="566"/>
+        <w:jc w:val="both"/>
+        <w:rPr/>
+      </w:pPr>
       <w:r>
         <w:rPr>
           <w:rFonts w:ascii="Times New Roman" w:hAnsi="Times New Roman" w:eastAsia="Times New Roman" w:cs="Times New Roman"/>
@@ -149,9 +158,8 @@
           <w:szCs w:val="28"/>
           <w:lang w:val="ru-RU"/>
         </w:rPr>
-        <w:t xml:space="preserve">ы устойчивости к антибиотикам и металлам нередко переносятся мобильными генетическими элементами (МГЭ), но для генов устойчивости к фториду такая связь систематически не оценивалась. Цель работы — выяснить, связаны ли эти гены с транспозазами и плазмидами.</w:t>
+        <w:t xml:space="preserve">Чтобы отделить сигнал от артефактов сборки, анализ вели на трёх сборках метагенома: из коротких прочтений Illumina, гибридной (Illumina и Nanopore, обе metaSPAdes) и из длинных прочтений (metaFlye). Локусом считали рибопереключатель и ген экспортёра на одной цепи не далее 200 п. н. друг от друга. Транспозазы и рекомбиназы искали по профилям Pfam, плазмиды — geNomad [4]. Ожидаемые числа рассчитывали по той же сборке с учётом длины контигов (биномиальный и пуассон-биномиальный критерии).</w:t>
       </w:r>
-      <w:r/>
     </w:p>
     <w:p>
       <w:pPr>
@@ -168,8 +176,17 @@
           <w:szCs w:val="28"/>
           <w:lang w:val="ru-RU"/>
         </w:rPr>
-        <w:t xml:space="preserve">Сравнивали три сборки </w:t>
+        <w:t xml:space="preserve">Гибридная сборка содержит все 10 локусов на 9 контигах, сборка из коротких прочтений — 9, из длинных — 7. Транспозаз рядом с экспортёрами не больше, чем ожидается случайно: в окнах ±10 генов их 1, 3 и 5 при ожидаемых 3,9, 6,2 и 6,6 (p ≥ 0,79). Контиги с локусами в гибридной сборке по медиане более чем втрое длиннее, но новых транспозаз рядом с ними нет: фрагментацией результат не объясняется.</w:t>
       </w:r>
+    </w:p>
+    <w:p>
+      <w:pPr>
+        <w:pBdr/>
+        <w:spacing w:line="276" w:lineRule="auto"/>
+        <w:ind w:firstLine="566"/>
+        <w:jc w:val="both"/>
+        <w:rPr/>
+      </w:pPr>
       <w:r>
         <w:rPr>
           <w:rFonts w:ascii="Times New Roman" w:hAnsi="Times New Roman" w:eastAsia="Times New Roman" w:cs="Times New Roman"/>
@@ -177,72 +194,7 @@
           <w:szCs w:val="28"/>
           <w:lang w:val="ru-RU"/>
         </w:rPr>
-        <w:t xml:space="preserve">метагенома воды: из коротких прочтений Illumina и гибридную из прочтений Illumina и Nanopore (обе metaSPAdes [3]), а также из длинных прочтений (metaFlye [4]). Локусом считали рибопереключатель и ген экспортёра на одной цепи не далее 200 п. н. друг от друг</w:t>
-      </w:r>
-      <w:r>
-        <w:rPr>
-          <w:rFonts w:ascii="Times New Roman" w:hAnsi="Times New Roman" w:eastAsia="Times New Roman" w:cs="Times New Roman"/>
-          <w:sz w:val="28"/>
-          <w:szCs w:val="28"/>
-          <w:lang w:val="ru-RU"/>
-        </w:rPr>
-        <w:t xml:space="preserve">а. Транспозазы и родственные рекомбиназы искали по профилям Pfam, плазмиды — программой geNomad [5]. Ожидаемые числа транспозаз и плазмид рассчитывали по генам и контигам той же сборки с учётом длины контигов (биномиальный и пуассон-биномиальный критерии).</w:t>
-      </w:r>
-      <w:r/>
-    </w:p>
-    <w:p>
-      <w:pPr>
-        <w:pBdr/>
-        <w:spacing w:line="276" w:lineRule="auto"/>
-        <w:ind w:firstLine="566"/>
-        <w:jc w:val="both"/>
-        <w:rPr/>
-      </w:pPr>
-      <w:r>
-        <w:rPr>
-          <w:rFonts w:ascii="Times New Roman" w:hAnsi="Times New Roman" w:eastAsia="Times New Roman" w:cs="Times New Roman"/>
-          <w:sz w:val="28"/>
-          <w:szCs w:val="28"/>
-          <w:lang w:val="ru-RU"/>
-        </w:rPr>
-        <w:t xml:space="preserve">Гибридная сборка содержит все 10 выявленных локусов на 9 контигах, короткая — 9 локусов, длинная — 7. Транспозаз рядом с экспортёрами не больше, чем ожидается случайно: в окнах ±10 генов их 1, 3 и 5 при ожидаемых 3,9, 6,2 и 6,6 (короткая, гибри</w:t>
-      </w:r>
-      <w:r>
-        <w:rPr>
-          <w:rFonts w:ascii="Times New Roman" w:hAnsi="Times New Roman" w:eastAsia="Times New Roman" w:cs="Times New Roman"/>
-          <w:sz w:val="28"/>
-          <w:szCs w:val="28"/>
-          <w:lang w:val="ru-RU"/>
-        </w:rPr>
-        <w:t xml:space="preserve">дная и длинная сборки; p ≥ 0,79). Контиги с локусами в гибридной сборке по медиане более чем втрое длиннее, чем в короткой, но новых транспозаз рядом с локусами нет. Поэтому отрицательный результат вряд ли объясняется обрывом коротких контигов на повторах.</w:t>
-      </w:r>
-      <w:r/>
-    </w:p>
-    <w:p>
-      <w:pPr>
-        <w:pBdr/>
-        <w:spacing w:line="276" w:lineRule="auto"/>
-        <w:ind w:firstLine="566"/>
-        <w:jc w:val="both"/>
-        <w:rPr/>
-      </w:pPr>
-      <w:r>
-        <w:rPr>
-          <w:rFonts w:ascii="Times New Roman" w:hAnsi="Times New Roman" w:eastAsia="Times New Roman" w:cs="Times New Roman"/>
-          <w:sz w:val="28"/>
-          <w:szCs w:val="28"/>
-          <w:lang w:val="ru-RU"/>
-        </w:rPr>
-        <w:t xml:space="preserve">Среди контигов</w:t>
-      </w:r>
-      <w:r>
-        <w:rPr>
-          <w:rFonts w:ascii="Times New Roman" w:hAnsi="Times New Roman" w:eastAsia="Times New Roman" w:cs="Times New Roman"/>
-          <w:sz w:val="28"/>
-          <w:szCs w:val="28"/>
-          <w:lang w:val="ru-RU"/>
-        </w:rPr>
-        <w:t xml:space="preserve"> с локусами плазмидными оказались 3 из 9 в короткой сборке и 4 из 9 в гибридной при ожидаемых 0,13 и 0,34 (p = 1,5·10⁻⁴ и 1,6·10⁻⁴), в длинной — 1 из 6 (p = 0,13). Три элемента общие для короткой и гибридной сборок и подтверждены маркерными генами: плазмида </w:t>
+        <w:t xml:space="preserve">Плазмидными оказались 3 из 9 контигов с локусами в сборке из коротких прочтений и 4 из 9 в гибридной при ожидаемых 0,13 и 0,34 (p = 1,5·10⁻⁴ и 1,6·10⁻⁴), в сборке из длинных прочтений — 1 из 6 (p = 0,13). Три элемента подтверждены маркерными генами: плазмида </w:t>
       </w:r>
       <w:r>
         <w:rPr>
@@ -282,7 +234,7 @@
           <w:szCs w:val="28"/>
           <w:lang w:val="ru-RU"/>
         </w:rPr>
-        <w:t xml:space="preserve"> с генами системы секреции IV типа и контиг </w:t>
+        <w:t xml:space="preserve"> с генами секреции IV типа и контиг </w:t>
       </w:r>
       <w:r>
         <w:rPr>
@@ -302,9 +254,8 @@
           <w:szCs w:val="28"/>
           <w:lang w:val="ru-RU"/>
         </w:rPr>
-        <w:t xml:space="preserve"> длиной 457 тыс. п. н. с генами репликации плазмидного типа.</w:t>
+        <w:t xml:space="preserve"> с генами репликации плазмидного типа.</w:t>
       </w:r>
-      <w:r/>
     </w:p>
     <w:p>
       <w:pPr>
@@ -321,26 +272,8 @@
           <w:szCs w:val="28"/>
           <w:lang w:val="ru-RU"/>
         </w:rPr>
-        <w:t xml:space="preserve">Таким образом, связь локусов устойчивости к фториду с транспозазами не выявлена, тогда как на плазмидах и конъюгативных элементах они расположены значимо чаще ожидаемого. </w:t>
+        <w:t xml:space="preserve">Таким образом, связь локусов устойчивости к фториду с транспозазами не выявлена, тогда как на плазмидах и конъюгативных элементах они расположены значимо чаще ожидаемого, что позволяет предположить их горизонтальный перенос в составе таких элементов. Такие плазмиды интересны биотехнологии: внесение гена CLCᶠ на плазмиде повышает устойчивость бактерий к фториду и их способность разлагать фторорганические соединения [5] — основу биоремедиации стоков.</w:t>
       </w:r>
-      <w:r>
-        <w:rPr>
-          <w:rFonts w:ascii="Times New Roman" w:hAnsi="Times New Roman" w:eastAsia="Times New Roman" w:cs="Times New Roman"/>
-          <w:sz w:val="28"/>
-          <w:szCs w:val="28"/>
-          <w:lang w:val="ru-RU"/>
-        </w:rPr>
-        <w:t xml:space="preserve">Это позволяет предположить горизонтальный перенос генов устойчивости к фториду в составе плазмид и конъюгативных элементов.</w:t>
-      </w:r>
-      <w:r>
-        <w:rPr>
-          <w:rFonts w:ascii="Times New Roman" w:hAnsi="Times New Roman" w:eastAsia="Times New Roman" w:cs="Times New Roman"/>
-          <w:sz w:val="28"/>
-          <w:szCs w:val="28"/>
-          <w:lang w:val="ru-RU"/>
-        </w:rPr>
-      </w:r>
-      <w:r/>
     </w:p>
     <w:p>
       <w:pPr>
@@ -411,8 +344,47 @@
           <w:rFonts w:ascii="Times New Roman" w:hAnsi="Times New Roman" w:eastAsia="Times New Roman" w:cs="Times New Roman"/>
           <w:sz w:val="24"/>
           <w:szCs w:val="24"/>
+          <w:lang w:val="en-US"/>
         </w:rPr>
         <w:t xml:space="preserve">1. </w:t>
+      </w:r>
+      <w:r>
+        <w:rPr>
+          <w:rFonts w:ascii="Times New Roman" w:hAnsi="Times New Roman" w:eastAsia="Times New Roman" w:cs="Times New Roman"/>
+          <w:i/>
+          <w:iCs/>
+          <w:sz w:val="24"/>
+          <w:szCs w:val="24"/>
+          <w:lang w:val="en-US"/>
+        </w:rPr>
+        <w:t xml:space="preserve">Alexeev S.V., Alexeeva L.P., Svetlakov A.A. et al. </w:t>
+      </w:r>
+      <w:r>
+        <w:rPr>
+          <w:rFonts w:ascii="Times New Roman" w:hAnsi="Times New Roman" w:eastAsia="Times New Roman" w:cs="Times New Roman"/>
+          <w:sz w:val="24"/>
+          <w:szCs w:val="24"/>
+          <w:lang w:val="en-US"/>
+        </w:rPr>
+        <w:t xml:space="preserve">Geochemistry of groundwaters and surface waters, and ground ice of the Oka Plateau (Eastern Sayan, Russia) // Russian Geology and Geophysics. 2025. Vol. 66. P. 29–49.</w:t>
+      </w:r>
+    </w:p>
+    <w:p>
+      <w:pPr>
+        <w:pBdr/>
+        <w:spacing w:line="276" w:lineRule="auto"/>
+        <w:ind w:firstLine="566"/>
+        <w:jc w:val="both"/>
+        <w:rPr/>
+      </w:pPr>
+      <w:r>
+        <w:rPr>
+          <w:rFonts w:ascii="Times New Roman" w:hAnsi="Times New Roman" w:eastAsia="Times New Roman" w:cs="Times New Roman"/>
+          <w:sz w:val="24"/>
+          <w:szCs w:val="24"/>
+          <w:lang w:val="en-US"/>
+        </w:rPr>
+        <w:t xml:space="preserve">2. </w:t>
       </w:r>
       <w:r>
         <w:rPr>
@@ -434,7 +406,6 @@
         </w:rPr>
         <w:t xml:space="preserve">Widespread genetic switches and toxicity resistance proteins for fluoride // Science. 2012. Vol. 335. P. 233–235.</w:t>
       </w:r>
-      <w:r/>
     </w:p>
     <w:p>
       <w:pPr>
@@ -444,49 +415,12 @@
         <w:jc w:val="both"/>
         <w:rPr/>
       </w:pPr>
-      <w:r>
-        <w:rPr>
-          <w:rFonts w:ascii="Times New Roman" w:hAnsi="Times New Roman" w:eastAsia="Times New Roman" w:cs="Times New Roman"/>
-          <w:sz w:val="24"/>
-          <w:szCs w:val="24"/>
-        </w:rPr>
-        <w:t xml:space="preserve">2. </w:t>
-      </w:r>
-      <w:r>
-        <w:rPr>
-          <w:rFonts w:ascii="Times New Roman" w:hAnsi="Times New Roman" w:eastAsia="Times New Roman" w:cs="Times New Roman"/>
-          <w:i/>
-          <w:iCs/>
-          <w:sz w:val="24"/>
-          <w:szCs w:val="24"/>
-          <w:lang w:val="en-US"/>
-        </w:rPr>
-        <w:t xml:space="preserve">Stockbridge R.B., Lim H.-H., Otten R. et al. </w:t>
-      </w:r>
       <w:r>
         <w:rPr>
           <w:rFonts w:ascii="Times New Roman" w:hAnsi="Times New Roman" w:eastAsia="Times New Roman" w:cs="Times New Roman"/>
           <w:sz w:val="24"/>
           <w:szCs w:val="24"/>
           <w:lang w:val="en-US"/>
-        </w:rPr>
-        <w:t xml:space="preserve">Fluoride resistance and transport by riboswitch-controlled CLC antiporters // PNAS. 2012. Vol. 109. P. 15289–15294.</w:t>
-      </w:r>
-      <w:r/>
-    </w:p>
-    <w:p>
-      <w:pPr>
-        <w:pBdr/>
-        <w:spacing w:line="276" w:lineRule="auto"/>
-        <w:ind w:firstLine="566"/>
-        <w:jc w:val="both"/>
-        <w:rPr/>
-      </w:pPr>
-      <w:r>
-        <w:rPr>
-          <w:rFonts w:ascii="Times New Roman" w:hAnsi="Times New Roman" w:eastAsia="Times New Roman" w:cs="Times New Roman"/>
-          <w:sz w:val="24"/>
-          <w:szCs w:val="24"/>
         </w:rPr>
         <w:t xml:space="preserve">3. </w:t>
       </w:r>
@@ -499,7 +433,7 @@
           <w:szCs w:val="24"/>
           <w:lang w:val="en-US"/>
         </w:rPr>
-        <w:t xml:space="preserve">Nurk S., Meleshko D., Korobeynikov A., Pevzner P.A. </w:t>
+        <w:t xml:space="preserve">Partridge S.R., Kwong S.M., Firth N., Jensen S.O. </w:t>
       </w:r>
       <w:r>
         <w:rPr>
@@ -508,9 +442,8 @@
           <w:szCs w:val="24"/>
           <w:lang w:val="en-US"/>
         </w:rPr>
-        <w:t xml:space="preserve">metaSPAdes: a new versatile metagenomic assembler // Genome Research. 2017. Vol. 27. P. 824–834.</w:t>
+        <w:t xml:space="preserve">Mobile genetic elements associated with antimicrobial resistance // Clinical Microbiology Reviews. 2018. Vol. 31. Art. e00088-17.</w:t>
       </w:r>
-      <w:r/>
     </w:p>
     <w:p>
       <w:pPr>
@@ -520,25 +453,6 @@
         <w:jc w:val="both"/>
         <w:rPr/>
       </w:pPr>
-      <w:r>
-        <w:rPr>
-          <w:rFonts w:ascii="Times New Roman" w:hAnsi="Times New Roman" w:eastAsia="Times New Roman" w:cs="Times New Roman"/>
-          <w:sz w:val="24"/>
-          <w:szCs w:val="24"/>
-        </w:rPr>
-        <w:t xml:space="preserve">4. </w:t>
-      </w:r>
-      <w:r>
-        <w:rPr>
-          <w:rFonts w:ascii="Times New Roman" w:hAnsi="Times New Roman" w:eastAsia="Times New Roman" w:cs="Times New Roman"/>
-          <w:i/>
-          <w:iCs/>
-          <w:sz w:val="24"/>
-          <w:szCs w:val="24"/>
-          <w:lang w:val="en-US"/>
-        </w:rPr>
-        <w:t xml:space="preserve">Kolmogorov M., Bickhart D.M., Behsaz B. et al. </w:t>
-      </w:r>
       <w:r>
         <w:rPr>
           <w:rFonts w:ascii="Times New Roman" w:hAnsi="Times New Roman" w:eastAsia="Times New Roman" w:cs="Times New Roman"/>
@@ -546,25 +460,7 @@
           <w:szCs w:val="24"/>
           <w:lang w:val="en-US"/>
         </w:rPr>
-        <w:t xml:space="preserve">metaFlye: scalable long-read metagenome assembly using repeat graphs // Nature Methods. 2020. Vol. 17. P. 1103–1110.</w:t>
-      </w:r>
-      <w:r/>
-    </w:p>
-    <w:p>
-      <w:pPr>
-        <w:pBdr/>
-        <w:spacing w:line="276" w:lineRule="auto"/>
-        <w:ind w:firstLine="566"/>
-        <w:jc w:val="both"/>
-        <w:rPr/>
-      </w:pPr>
-      <w:r>
-        <w:rPr>
-          <w:rFonts w:ascii="Times New Roman" w:hAnsi="Times New Roman" w:eastAsia="Times New Roman" w:cs="Times New Roman"/>
-          <w:sz w:val="24"/>
-          <w:szCs w:val="24"/>
-        </w:rPr>
-        <w:t xml:space="preserve">5. </w:t>
+        <w:t xml:space="preserve">4. </w:t>
       </w:r>
       <w:r>
         <w:rPr>
@@ -586,7 +482,44 @@
         </w:rPr>
         <w:t xml:space="preserve">Identification of mobile genetic elements with geNomad // Nature Biotechnology. 2024. Vol. 42. P. 1303–1312.</w:t>
       </w:r>
-      <w:r/>
+    </w:p>
+    <w:p>
+      <w:pPr>
+        <w:pBdr/>
+        <w:spacing w:line="276" w:lineRule="auto"/>
+        <w:ind w:firstLine="566"/>
+        <w:jc w:val="both"/>
+        <w:rPr/>
+      </w:pPr>
+      <w:r>
+        <w:rPr>
+          <w:rFonts w:ascii="Times New Roman" w:hAnsi="Times New Roman" w:eastAsia="Times New Roman" w:cs="Times New Roman"/>
+          <w:sz w:val="24"/>
+          <w:szCs w:val="24"/>
+          <w:lang w:val="en-US"/>
+        </w:rPr>
+        <w:t xml:space="preserve">5. </w:t>
+      </w:r>
+      <w:r>
+        <w:rPr>
+          <w:rFonts w:ascii="Times New Roman" w:hAnsi="Times New Roman" w:eastAsia="Times New Roman" w:cs="Times New Roman"/>
+          <w:i/>
+          <w:iCs/>
+          <w:sz w:val="24"/>
+          <w:szCs w:val="24"/>
+          <w:lang w:val="en-US"/>
+        </w:rPr>
+        <w:t xml:space="preserve">Dodge A.G., O'Connor M.R., Wackett L.P. </w:t>
+      </w:r>
+      <w:r>
+        <w:rPr>
+          <w:rFonts w:ascii="Times New Roman" w:hAnsi="Times New Roman" w:eastAsia="Times New Roman" w:cs="Times New Roman"/>
+          <w:sz w:val="24"/>
+          <w:szCs w:val="24"/>
+          <w:lang w:val="en-US"/>
+        </w:rPr>
+        <w:t xml:space="preserve">CLCF, not CrcB, protects Pseudomonas putida ATCC 12633 during intense fluoride stress // Environmental Microbiology. 2026. Vol. 28. Art. e70385.</w:t>
+      </w:r>
     </w:p>
     <w:sectPr>
       <w:footnotePr/>

</xml_diff>